<commit_message>
feat(india-pakistan): add proxy sensitivity variants and joint-report drafts
Proxy model: drift variant without the income contribution and a Pakistan
variant without the urban-share and animal-protein factors, plus a US
comparison usable with any forecast year. Main scenario rows unchanged;
21 new quantiles reproduced independently.

Joint-report drafts (tested and accepted): D2 AI driver, D3 talent and
allocation, D4 definitions message, D6 measurement box, D7 future-research
agenda, and the workspace records patch. Report template, row counts,
claim index, PDF and DOCX exports and provenance records updated.

Co-Authored-By: Claude Opus 5.5 <noreply@anthropic.com>
</commit_message>
<xml_diff>
--- a/research/india-pakistan/report/report.docx
+++ b/research/india-pakistan/report/report.docx
@@ -7190,6 +7190,74 @@
         <w:t xml:space="preserve">million for the drift.</w:t>
       </w:r>
     </w:p>
+    <w:p>
+      <w:pPr>
+        <w:pStyle w:val="BodyText"/>
+      </w:pPr>
+      <w:r>
+        <w:t xml:space="preserve">Vacancy growth may include income growth; a sensitivity that subtracts the income contribution from the high drift bound gives an India</w:t>
+      </w:r>
+      <w:r>
+        <w:t xml:space="preserve"> </w:t>
+      </w:r>
+      <w:r>
+        <w:t xml:space="preserve">2035</w:t>
+      </w:r>
+      <w:r>
+        <w:t xml:space="preserve"> </w:t>
+      </w:r>
+      <w:r>
+        <w:t xml:space="preserve">middle value of</w:t>
+      </w:r>
+      <w:r>
+        <w:t xml:space="preserve"> </w:t>
+      </w:r>
+      <w:r>
+        <w:t xml:space="preserve">215</w:t>
+      </w:r>
+      <w:r>
+        <w:t xml:space="preserve"> </w:t>
+      </w:r>
+      <w:r>
+        <w:t xml:space="preserve">million dollars. Pakistan’s four multipliers may also overlap; removing its relative urban share and animal protein factors gives a</w:t>
+      </w:r>
+      <w:r>
+        <w:t xml:space="preserve"> </w:t>
+      </w:r>
+      <w:r>
+        <w:t xml:space="preserve">2035</w:t>
+      </w:r>
+      <w:r>
+        <w:t xml:space="preserve"> </w:t>
+      </w:r>
+      <w:r>
+        <w:t xml:space="preserve">range of</w:t>
+      </w:r>
+      <w:r>
+        <w:t xml:space="preserve"> </w:t>
+      </w:r>
+      <w:r>
+        <w:t xml:space="preserve">2.6</w:t>
+      </w:r>
+      <w:r>
+        <w:t xml:space="preserve"> </w:t>
+      </w:r>
+      <w:r>
+        <w:t xml:space="preserve">to</w:t>
+      </w:r>
+      <w:r>
+        <w:t xml:space="preserve"> </w:t>
+      </w:r>
+      <w:r>
+        <w:t xml:space="preserve">25.3</w:t>
+      </w:r>
+      <w:r>
+        <w:t xml:space="preserve"> </w:t>
+      </w:r>
+      <w:r>
+        <w:t xml:space="preserve">million dollars.</w:t>
+      </w:r>
+    </w:p>
     <w:bookmarkEnd w:id="52"/>
     <w:bookmarkStart w:id="53" w:name="projecting-the-drivers-forward"/>
     <w:p>
@@ -23563,7 +23631,7 @@
               <w:t xml:space="preserve"> </w:t>
             </w:r>
             <w:r>
-              <w:t xml:space="preserve">104</w:t>
+              <w:t xml:space="preserve">127</w:t>
             </w:r>
             <w:r>
               <w:t xml:space="preserve"> </w:t>
@@ -33212,6 +33280,164 @@
               <w:pStyle w:val="Compact"/>
             </w:pPr>
             <w:r>
+              <w:t xml:space="preserve">proxy_india_2035_market_value_drift_overlap_adjusted_p50</w:t>
+            </w:r>
+            <w:r>
+              <w:t xml:space="preserve">. altprotein proxy scenarios; row id</w:t>
+            </w:r>
+            <w:r>
+              <w:t xml:space="preserve"> </w:t>
+            </w:r>
+            <w:r>
+              <w:t xml:space="preserve">india_2035_market_value_drift_overlap_adjusted_p50</w:t>
+            </w:r>
+            <w:r>
+              <w:t xml:space="preserve">;</w:t>
+            </w:r>
+            <w:r>
+              <w:t xml:space="preserve"> </w:t>
+            </w:r>
+            <w:r>
+              <w:t xml:space="preserve">value</w:t>
+            </w:r>
+            <w:r>
+              <w:t xml:space="preserve">:</w:t>
+            </w:r>
+            <w:r>
+              <w:t xml:space="preserve"> </w:t>
+            </w:r>
+            <w:r>
+              <w:t xml:space="preserve">215</w:t>
+            </w:r>
+            <w:r>
+              <w:t xml:space="preserve"> </w:t>
+            </w:r>
+            <w:r>
+              <w:t xml:space="preserve">million US dollars at constant prices; tier derived; Source;</w:t>
+            </w:r>
+            <w:r>
+              <w:t xml:space="preserve"> </w:t>
+            </w:r>
+            <w:hyperlink ns1:id="rId36">
+              <w:r>
+                <w:rPr>
+                  <w:rStyle w:val="Hyperlink"/>
+                </w:rPr>
+                <w:t xml:space="preserve">Source</w:t>
+              </w:r>
+            </w:hyperlink>
+            <w:r>
+              <w:t xml:space="preserve">;</w:t>
+            </w:r>
+            <w:r>
+              <w:t xml:space="preserve"> </w:t>
+            </w:r>
+            <w:hyperlink ns1:id="rId13">
+              <w:r>
+                <w:rPr>
+                  <w:rStyle w:val="Hyperlink"/>
+                </w:rPr>
+                <w:t xml:space="preserve">Source</w:t>
+              </w:r>
+            </w:hyperlink>
+            <w:r>
+              <w:t xml:space="preserve">;</w:t>
+            </w:r>
+            <w:r>
+              <w:t xml:space="preserve"> </w:t>
+            </w:r>
+            <w:hyperlink ns1:id="rId45">
+              <w:r>
+                <w:rPr>
+                  <w:rStyle w:val="Hyperlink"/>
+                </w:rPr>
+                <w:t xml:space="preserve">Source</w:t>
+              </w:r>
+            </w:hyperlink>
+            <w:r>
+              <w:t xml:space="preserve">;</w:t>
+            </w:r>
+            <w:r>
+              <w:t xml:space="preserve"> </w:t>
+            </w:r>
+            <w:hyperlink ns1:id="rId46">
+              <w:r>
+                <w:rPr>
+                  <w:rStyle w:val="Hyperlink"/>
+                </w:rPr>
+                <w:t xml:space="preserve">Source</w:t>
+              </w:r>
+            </w:hyperlink>
+            <w:r>
+              <w:t xml:space="preserve">;</w:t>
+            </w:r>
+            <w:r>
+              <w:t xml:space="preserve"> </w:t>
+            </w:r>
+            <w:hyperlink ns1:id="rId48">
+              <w:r>
+                <w:rPr>
+                  <w:rStyle w:val="Hyperlink"/>
+                </w:rPr>
+                <w:t xml:space="preserve">Source</w:t>
+              </w:r>
+            </w:hyperlink>
+            <w:r>
+              <w:t xml:space="preserve">;</w:t>
+            </w:r>
+            <w:r>
+              <w:t xml:space="preserve"> </w:t>
+            </w:r>
+            <w:hyperlink ns1:id="rId47">
+              <w:r>
+                <w:rPr>
+                  <w:rStyle w:val="Hyperlink"/>
+                </w:rPr>
+                <w:t xml:space="preserve">Source</w:t>
+              </w:r>
+            </w:hyperlink>
+            <w:r>
+              <w:t xml:space="preserve">;</w:t>
+            </w:r>
+            <w:r>
+              <w:t xml:space="preserve"> </w:t>
+            </w:r>
+            <w:hyperlink ns1:id="rId152">
+              <w:r>
+                <w:rPr>
+                  <w:rStyle w:val="Hyperlink"/>
+                </w:rPr>
+                <w:t xml:space="preserve">Source</w:t>
+              </w:r>
+            </w:hyperlink>
+            <w:r>
+              <w:t xml:space="preserve">;</w:t>
+            </w:r>
+            <w:r>
+              <w:t xml:space="preserve"> </w:t>
+            </w:r>
+            <w:hyperlink ns1:id="rId49">
+              <w:r>
+                <w:rPr>
+                  <w:rStyle w:val="Hyperlink"/>
+                </w:rPr>
+                <w:t xml:space="preserve">Source</w:t>
+              </w:r>
+            </w:hyperlink>
+          </w:p>
+        </w:tc>
+      </w:tr>
+      <w:tr>
+        <w:trPr>
+          <w:cantSplit/>
+        </w:trPr>
+        <w:tc>
+          <w:tcPr/>
+          <w:p>
+            <w:pPr>
+              <w:pStyle w:val="Compact"/>
+            </w:pPr>
+            <w:r>
               <w:t xml:space="preserve">proxy_india_2035_market_value_elasticity_fixed_high</w:t>
             </w:r>
             <w:r>
@@ -37466,6 +37692,322 @@
             </w:r>
             <w:r>
               <w:t xml:space="preserve">36.1</w:t>
+            </w:r>
+            <w:r>
+              <w:t xml:space="preserve"> </w:t>
+            </w:r>
+            <w:r>
+              <w:t xml:space="preserve">million US dollars at constant prices; tier derived; Source;</w:t>
+            </w:r>
+            <w:r>
+              <w:t xml:space="preserve"> </w:t>
+            </w:r>
+            <w:hyperlink ns1:id="rId36">
+              <w:r>
+                <w:rPr>
+                  <w:rStyle w:val="Hyperlink"/>
+                </w:rPr>
+                <w:t xml:space="preserve">Source</w:t>
+              </w:r>
+            </w:hyperlink>
+            <w:r>
+              <w:t xml:space="preserve">;</w:t>
+            </w:r>
+            <w:r>
+              <w:t xml:space="preserve"> </w:t>
+            </w:r>
+            <w:hyperlink ns1:id="rId13">
+              <w:r>
+                <w:rPr>
+                  <w:rStyle w:val="Hyperlink"/>
+                </w:rPr>
+                <w:t xml:space="preserve">Source</w:t>
+              </w:r>
+            </w:hyperlink>
+            <w:r>
+              <w:t xml:space="preserve">;</w:t>
+            </w:r>
+            <w:r>
+              <w:t xml:space="preserve"> </w:t>
+            </w:r>
+            <w:hyperlink ns1:id="rId45">
+              <w:r>
+                <w:rPr>
+                  <w:rStyle w:val="Hyperlink"/>
+                </w:rPr>
+                <w:t xml:space="preserve">Source</w:t>
+              </w:r>
+            </w:hyperlink>
+            <w:r>
+              <w:t xml:space="preserve">;</w:t>
+            </w:r>
+            <w:r>
+              <w:t xml:space="preserve"> </w:t>
+            </w:r>
+            <w:hyperlink ns1:id="rId46">
+              <w:r>
+                <w:rPr>
+                  <w:rStyle w:val="Hyperlink"/>
+                </w:rPr>
+                <w:t xml:space="preserve">Source</w:t>
+              </w:r>
+            </w:hyperlink>
+            <w:r>
+              <w:t xml:space="preserve">;</w:t>
+            </w:r>
+            <w:r>
+              <w:t xml:space="preserve"> </w:t>
+            </w:r>
+            <w:hyperlink ns1:id="rId48">
+              <w:r>
+                <w:rPr>
+                  <w:rStyle w:val="Hyperlink"/>
+                </w:rPr>
+                <w:t xml:space="preserve">Source</w:t>
+              </w:r>
+            </w:hyperlink>
+            <w:r>
+              <w:t xml:space="preserve">;</w:t>
+            </w:r>
+            <w:r>
+              <w:t xml:space="preserve"> </w:t>
+            </w:r>
+            <w:hyperlink ns1:id="rId47">
+              <w:r>
+                <w:rPr>
+                  <w:rStyle w:val="Hyperlink"/>
+                </w:rPr>
+                <w:t xml:space="preserve">Source</w:t>
+              </w:r>
+            </w:hyperlink>
+            <w:r>
+              <w:t xml:space="preserve">;</w:t>
+            </w:r>
+            <w:r>
+              <w:t xml:space="preserve"> </w:t>
+            </w:r>
+            <w:hyperlink ns1:id="rId152">
+              <w:r>
+                <w:rPr>
+                  <w:rStyle w:val="Hyperlink"/>
+                </w:rPr>
+                <w:t xml:space="preserve">Source</w:t>
+              </w:r>
+            </w:hyperlink>
+            <w:r>
+              <w:t xml:space="preserve">;</w:t>
+            </w:r>
+            <w:r>
+              <w:t xml:space="preserve"> </w:t>
+            </w:r>
+            <w:hyperlink ns1:id="rId49">
+              <w:r>
+                <w:rPr>
+                  <w:rStyle w:val="Hyperlink"/>
+                </w:rPr>
+                <w:t xml:space="preserve">Source</w:t>
+              </w:r>
+            </w:hyperlink>
+          </w:p>
+        </w:tc>
+      </w:tr>
+      <w:tr>
+        <w:trPr>
+          <w:cantSplit/>
+        </w:trPr>
+        <w:tc>
+          <w:tcPr/>
+          <w:p>
+            <w:pPr>
+              <w:pStyle w:val="Compact"/>
+            </w:pPr>
+            <w:r>
+              <w:t xml:space="preserve">proxy_pakistan_2035_market_value_without_urban_animal_p10</w:t>
+            </w:r>
+            <w:r>
+              <w:t xml:space="preserve">. altprotein proxy scenarios; row id</w:t>
+            </w:r>
+            <w:r>
+              <w:t xml:space="preserve"> </w:t>
+            </w:r>
+            <w:r>
+              <w:t xml:space="preserve">pakistan_2035_market_value_without_urban_animal_p10</w:t>
+            </w:r>
+            <w:r>
+              <w:t xml:space="preserve">;</w:t>
+            </w:r>
+            <w:r>
+              <w:t xml:space="preserve"> </w:t>
+            </w:r>
+            <w:r>
+              <w:t xml:space="preserve">value</w:t>
+            </w:r>
+            <w:r>
+              <w:t xml:space="preserve">:</w:t>
+            </w:r>
+            <w:r>
+              <w:t xml:space="preserve"> </w:t>
+            </w:r>
+            <w:r>
+              <w:t xml:space="preserve">2.6</w:t>
+            </w:r>
+            <w:r>
+              <w:t xml:space="preserve"> </w:t>
+            </w:r>
+            <w:r>
+              <w:t xml:space="preserve">million US dollars at constant prices; tier derived; Source;</w:t>
+            </w:r>
+            <w:r>
+              <w:t xml:space="preserve"> </w:t>
+            </w:r>
+            <w:hyperlink ns1:id="rId36">
+              <w:r>
+                <w:rPr>
+                  <w:rStyle w:val="Hyperlink"/>
+                </w:rPr>
+                <w:t xml:space="preserve">Source</w:t>
+              </w:r>
+            </w:hyperlink>
+            <w:r>
+              <w:t xml:space="preserve">;</w:t>
+            </w:r>
+            <w:r>
+              <w:t xml:space="preserve"> </w:t>
+            </w:r>
+            <w:hyperlink ns1:id="rId13">
+              <w:r>
+                <w:rPr>
+                  <w:rStyle w:val="Hyperlink"/>
+                </w:rPr>
+                <w:t xml:space="preserve">Source</w:t>
+              </w:r>
+            </w:hyperlink>
+            <w:r>
+              <w:t xml:space="preserve">;</w:t>
+            </w:r>
+            <w:r>
+              <w:t xml:space="preserve"> </w:t>
+            </w:r>
+            <w:hyperlink ns1:id="rId45">
+              <w:r>
+                <w:rPr>
+                  <w:rStyle w:val="Hyperlink"/>
+                </w:rPr>
+                <w:t xml:space="preserve">Source</w:t>
+              </w:r>
+            </w:hyperlink>
+            <w:r>
+              <w:t xml:space="preserve">;</w:t>
+            </w:r>
+            <w:r>
+              <w:t xml:space="preserve"> </w:t>
+            </w:r>
+            <w:hyperlink ns1:id="rId46">
+              <w:r>
+                <w:rPr>
+                  <w:rStyle w:val="Hyperlink"/>
+                </w:rPr>
+                <w:t xml:space="preserve">Source</w:t>
+              </w:r>
+            </w:hyperlink>
+            <w:r>
+              <w:t xml:space="preserve">;</w:t>
+            </w:r>
+            <w:r>
+              <w:t xml:space="preserve"> </w:t>
+            </w:r>
+            <w:hyperlink ns1:id="rId48">
+              <w:r>
+                <w:rPr>
+                  <w:rStyle w:val="Hyperlink"/>
+                </w:rPr>
+                <w:t xml:space="preserve">Source</w:t>
+              </w:r>
+            </w:hyperlink>
+            <w:r>
+              <w:t xml:space="preserve">;</w:t>
+            </w:r>
+            <w:r>
+              <w:t xml:space="preserve"> </w:t>
+            </w:r>
+            <w:hyperlink ns1:id="rId47">
+              <w:r>
+                <w:rPr>
+                  <w:rStyle w:val="Hyperlink"/>
+                </w:rPr>
+                <w:t xml:space="preserve">Source</w:t>
+              </w:r>
+            </w:hyperlink>
+            <w:r>
+              <w:t xml:space="preserve">;</w:t>
+            </w:r>
+            <w:r>
+              <w:t xml:space="preserve"> </w:t>
+            </w:r>
+            <w:hyperlink ns1:id="rId152">
+              <w:r>
+                <w:rPr>
+                  <w:rStyle w:val="Hyperlink"/>
+                </w:rPr>
+                <w:t xml:space="preserve">Source</w:t>
+              </w:r>
+            </w:hyperlink>
+            <w:r>
+              <w:t xml:space="preserve">;</w:t>
+            </w:r>
+            <w:r>
+              <w:t xml:space="preserve"> </w:t>
+            </w:r>
+            <w:hyperlink ns1:id="rId49">
+              <w:r>
+                <w:rPr>
+                  <w:rStyle w:val="Hyperlink"/>
+                </w:rPr>
+                <w:t xml:space="preserve">Source</w:t>
+              </w:r>
+            </w:hyperlink>
+          </w:p>
+        </w:tc>
+      </w:tr>
+      <w:tr>
+        <w:trPr>
+          <w:cantSplit/>
+        </w:trPr>
+        <w:tc>
+          <w:tcPr/>
+          <w:p>
+            <w:pPr>
+              <w:pStyle w:val="Compact"/>
+            </w:pPr>
+            <w:r>
+              <w:t xml:space="preserve">proxy_pakistan_2035_market_value_without_urban_animal_p90</w:t>
+            </w:r>
+            <w:r>
+              <w:t xml:space="preserve">. altprotein proxy scenarios; row id</w:t>
+            </w:r>
+            <w:r>
+              <w:t xml:space="preserve"> </w:t>
+            </w:r>
+            <w:r>
+              <w:t xml:space="preserve">pakistan_2035_market_value_without_urban_animal_p90</w:t>
+            </w:r>
+            <w:r>
+              <w:t xml:space="preserve">;</w:t>
+            </w:r>
+            <w:r>
+              <w:t xml:space="preserve"> </w:t>
+            </w:r>
+            <w:r>
+              <w:t xml:space="preserve">value</w:t>
+            </w:r>
+            <w:r>
+              <w:t xml:space="preserve">:</w:t>
+            </w:r>
+            <w:r>
+              <w:t xml:space="preserve"> </w:t>
+            </w:r>
+            <w:r>
+              <w:t xml:space="preserve">25.3</w:t>
             </w:r>
             <w:r>
               <w:t xml:space="preserve"> </w:t>
@@ -42273,7 +42815,7 @@
               <w:pStyle w:val="Compact"/>
             </w:pPr>
             <w:r>
-              <w:t xml:space="preserve">104</w:t>
+              <w:t xml:space="preserve">127</w:t>
             </w:r>
           </w:p>
         </w:tc>

</xml_diff>